<commit_message>
Update architecture poster, project proposal doc, and add future work roadmap for multi-disease detection
</commit_message>
<xml_diff>
--- a/docs/FedScreen_Project_Proposal.docx
+++ b/docs/FedScreen_Project_Proposal.docx
@@ -13,13 +13,7 @@
     <w:p>
       <w:pPr/>
       <w:r>
-        <w:t xml:space="preserve">Oct 17, 2026</w:t>
-      </w:r>
-      <w:r>
-        <w:t xml:space="preserve"> · </w:t>
-      </w:r>
-      <w:r>
-        <w:t xml:space="preserve">@syed</w:t>
+        <w:t xml:space="preserve">Oct 17, 2026 · @syed</w:t>
       </w:r>
     </w:p>
     <w:p>
@@ -39,7 +33,7 @@
         <w:t xml:space="preserve">FedScreen is one lightweight AI model that helps screen blood-cell images for malaria, anemia and leukemia, and is built so clinics can improve it together without ever sharing patient images.</w:t>
       </w:r>
       <w:r>
-        <w:t xml:space="preserve"> On held-out, patient-disjoint test sets it reaches macro-F1 of 0.967 for malaria, 0.835 for anemia and 0.892 for leukemia, and a working clinician-facing app already runs on an ordinary CPU in about 29 ms per image. We are asking for support to move from a validated prototype to a small, supervised pilot at primary health centres (PHCs).</w:t>
+        <w:t xml:space="preserve"> On held-out, patient-disjoint test sets it reaches macro-F1 of 0.967 for malaria, 0.835 for anemia and 0.892 for leukemia (centralized; 0.815 under federated training), and a working clinician-facing app already runs on an ordinary CPU in about 29 ms per image. We are asking for support to move from a validated prototype to a small, supervised pilot at primary health centres (PHCs).</w:t>
       </w:r>
     </w:p>
     <w:p>
@@ -491,12 +485,24 @@
           <w:p>
             <w:pPr/>
             <w:r>
-              <w:t xml:space="preserve">Largest federated gap; needs re-checking at the same threshold</w:t>
+              <w:t xml:space="preserve">Largest federated gap: 0.892 centralized (fixed 0.50 cut-off) vs 0.815 federated (FedProx, five virtual centres); to be re-checked at the same 0.50 threshold</w:t>
             </w:r>
           </w:p>
         </w:tc>
       </w:tr>
     </w:tbl>
+    <w:p>
+      <w:pPr/>
+      <w:r>
+        <w:rPr>
+          <w:b/>
+        </w:rPr>
+        <w:t xml:space="preserve">Note on leukemia:</w:t>
+      </w:r>
+      <w:r>
+        <w:t xml:space="preserve"> 0.892 is the centralized multi-task result at the fixed 0.50 cut-off (AUC 0.950). An earlier 0.575 figure came from an over-high validation-tuned threshold (0.783) and is discarded. 0.815 is the federated result under decentralized FedProx training across five virtual centres.</w:t>
+      </w:r>
+    </w:p>
     <w:p>
       <w:pPr/>
       <w:r>
@@ -694,7 +700,7 @@
         <w:t xml:space="preserve">Limits we are open about:</w:t>
       </w:r>
       <w:r>
-        <w:t xml:space="preserve"> the 25 MB size target is not yet met (35.2 MB); the leukemia federated result is indicative until re-evaluated; the specimen router scored 100% on a random split that was not patient-disjoint; all data so far is public, so performance at a new clinic is unproven. Early mistakes (data leakage, a failed threshold, collapsed multi-task training) were found, documented and fixed, and that same discipline will guide the pilot.</w:t>
+        <w:t xml:space="preserve"> the 25 MB size target is not yet met (35.2 MB); the leukemia federated result (0.815) is indicative until re-evaluated at the fixed 0.50 threshold; the specimen router scored 100% on a random split that was not patient-disjoint; all data so far is public, so performance at a new clinic is unproven. Early mistakes (data leakage, a failed threshold, collapsed multi-task training) were found, documented and fixed, and that same discipline will guide the pilot.</w:t>
       </w:r>
     </w:p>
     <w:sectPr>

</xml_diff>